<commit_message>
[releng] Update M2Doc version in E-BookStore templates to 3.3.2
</commit_message>
<xml_diff>
--- a/samples/plugins/org.obeonetwork.is.samples/contents/E-BookStore/documentation/doc-src/E-BookStore_Cinematic_template.docx
+++ b/samples/plugins/org.obeonetwork.is.samples/contents/E-BookStore/documentation/doc-src/E-BookStore_Cinematic_template.docx
@@ -14,6 +14,9 @@
           <w:lang w:val="fr-FR"/>
         </w:rPr>
       </w:pPr>
+      <w:r>
+        <w:t/>
+      </w:r>
     </w:p>
     <w:p>
       <w:pPr>
@@ -27,6 +30,9 @@
           <w:lang w:val="fr-FR"/>
         </w:rPr>
       </w:pPr>
+      <w:r>
+        <w:t/>
+      </w:r>
     </w:p>
     <w:p>
       <w:pPr>
@@ -40,6 +46,9 @@
           <w:lang w:val="fr-FR"/>
         </w:rPr>
       </w:pPr>
+      <w:r>
+        <w:t/>
+      </w:r>
     </w:p>
     <w:p>
       <w:pPr>
@@ -53,6 +62,9 @@
           <w:lang w:val="fr-FR"/>
         </w:rPr>
       </w:pPr>
+      <w:r>
+        <w:t/>
+      </w:r>
     </w:p>
     <w:p>
       <w:pPr>
@@ -148,6 +160,9 @@
           <w:szCs w:val="20"/>
         </w:rPr>
       </w:pPr>
+      <w:r>
+        <w:t/>
+      </w:r>
     </w:p>
     <w:p>
       <w:pPr>
@@ -158,6 +173,9 @@
           <w:szCs w:val="20"/>
         </w:rPr>
       </w:pPr>
+      <w:r>
+        <w:t/>
+      </w:r>
     </w:p>
     <w:p>
       <w:pPr>
@@ -168,6 +186,9 @@
           <w:szCs w:val="20"/>
         </w:rPr>
       </w:pPr>
+      <w:r>
+        <w:t/>
+      </w:r>
     </w:p>
     <w:p>
       <w:pPr>
@@ -231,6 +252,9 @@
           <w:lang w:eastAsia="fr-FR"/>
         </w:rPr>
       </w:pPr>
+      <w:r>
+        <w:t/>
+      </w:r>
     </w:p>
     <w:p>
       <w:pPr>
@@ -254,6 +278,9 @@
           <w:szCs w:val="20"/>
         </w:rPr>
       </w:pPr>
+      <w:r>
+        <w:t/>
+      </w:r>
     </w:p>
     <w:p>
       <w:pPr>
@@ -264,6 +291,9 @@
           <w:szCs w:val="20"/>
         </w:rPr>
       </w:pPr>
+      <w:r>
+        <w:t/>
+      </w:r>
     </w:p>
     <w:p>
       <w:pPr>
@@ -274,6 +304,9 @@
           <w:szCs w:val="20"/>
         </w:rPr>
       </w:pPr>
+      <w:r>
+        <w:t/>
+      </w:r>
     </w:p>
     <w:p>
       <w:r>
@@ -441,28 +474,44 @@
             <w:tcW w:w="2410" w:type="dxa"/>
             <w:vAlign w:val="center"/>
           </w:tcPr>
-          <w:p/>
+          <w:p>
+            <w:r>
+              <w:t/>
+            </w:r>
+          </w:p>
         </w:tc>
         <w:tc>
           <w:tcPr>
             <w:tcW w:w="2977" w:type="dxa"/>
             <w:vAlign w:val="center"/>
           </w:tcPr>
-          <w:p/>
+          <w:p>
+            <w:r>
+              <w:t/>
+            </w:r>
+          </w:p>
         </w:tc>
         <w:tc>
           <w:tcPr>
             <w:tcW w:w="1185" w:type="dxa"/>
             <w:vAlign w:val="center"/>
           </w:tcPr>
-          <w:p/>
+          <w:p>
+            <w:r>
+              <w:t/>
+            </w:r>
+          </w:p>
         </w:tc>
         <w:tc>
           <w:tcPr>
             <w:tcW w:w="1791" w:type="dxa"/>
             <w:vAlign w:val="center"/>
           </w:tcPr>
-          <w:p/>
+          <w:p>
+            <w:r>
+              <w:t/>
+            </w:r>
+          </w:p>
         </w:tc>
       </w:tr>
       <w:tr>
@@ -486,28 +535,44 @@
             <w:tcW w:w="2410" w:type="dxa"/>
             <w:vAlign w:val="center"/>
           </w:tcPr>
-          <w:p/>
+          <w:p>
+            <w:r>
+              <w:t/>
+            </w:r>
+          </w:p>
         </w:tc>
         <w:tc>
           <w:tcPr>
             <w:tcW w:w="2977" w:type="dxa"/>
             <w:vAlign w:val="center"/>
           </w:tcPr>
-          <w:p/>
+          <w:p>
+            <w:r>
+              <w:t/>
+            </w:r>
+          </w:p>
         </w:tc>
         <w:tc>
           <w:tcPr>
             <w:tcW w:w="1185" w:type="dxa"/>
             <w:vAlign w:val="center"/>
           </w:tcPr>
-          <w:p/>
+          <w:p>
+            <w:r>
+              <w:t/>
+            </w:r>
+          </w:p>
         </w:tc>
         <w:tc>
           <w:tcPr>
             <w:tcW w:w="1791" w:type="dxa"/>
             <w:vAlign w:val="center"/>
           </w:tcPr>
-          <w:p/>
+          <w:p>
+            <w:r>
+              <w:t/>
+            </w:r>
+          </w:p>
         </w:tc>
       </w:tr>
       <w:tr>
@@ -531,28 +596,44 @@
             <w:tcW w:w="2410" w:type="dxa"/>
             <w:vAlign w:val="center"/>
           </w:tcPr>
-          <w:p/>
+          <w:p>
+            <w:r>
+              <w:t/>
+            </w:r>
+          </w:p>
         </w:tc>
         <w:tc>
           <w:tcPr>
             <w:tcW w:w="2977" w:type="dxa"/>
             <w:vAlign w:val="center"/>
           </w:tcPr>
-          <w:p/>
+          <w:p>
+            <w:r>
+              <w:t/>
+            </w:r>
+          </w:p>
         </w:tc>
         <w:tc>
           <w:tcPr>
             <w:tcW w:w="1185" w:type="dxa"/>
             <w:vAlign w:val="center"/>
           </w:tcPr>
-          <w:p/>
+          <w:p>
+            <w:r>
+              <w:t/>
+            </w:r>
+          </w:p>
         </w:tc>
         <w:tc>
           <w:tcPr>
             <w:tcW w:w="1791" w:type="dxa"/>
             <w:vAlign w:val="center"/>
           </w:tcPr>
-          <w:p/>
+          <w:p>
+            <w:r>
+              <w:t/>
+            </w:r>
+          </w:p>
         </w:tc>
       </w:tr>
       <w:tr>
@@ -576,40 +657,72 @@
             <w:tcW w:w="2410" w:type="dxa"/>
             <w:vAlign w:val="center"/>
           </w:tcPr>
-          <w:p/>
+          <w:p>
+            <w:r>
+              <w:t/>
+            </w:r>
+          </w:p>
         </w:tc>
         <w:tc>
           <w:tcPr>
             <w:tcW w:w="2977" w:type="dxa"/>
             <w:vAlign w:val="center"/>
           </w:tcPr>
-          <w:p/>
+          <w:p>
+            <w:r>
+              <w:t/>
+            </w:r>
+          </w:p>
         </w:tc>
         <w:tc>
           <w:tcPr>
             <w:tcW w:w="1185" w:type="dxa"/>
             <w:vAlign w:val="center"/>
           </w:tcPr>
-          <w:p/>
+          <w:p>
+            <w:r>
+              <w:t/>
+            </w:r>
+          </w:p>
         </w:tc>
         <w:tc>
           <w:tcPr>
             <w:tcW w:w="1791" w:type="dxa"/>
             <w:vAlign w:val="center"/>
           </w:tcPr>
-          <w:p/>
+          <w:p>
+            <w:r>
+              <w:t/>
+            </w:r>
+          </w:p>
         </w:tc>
       </w:tr>
     </w:tbl>
-    <w:p/>
-    <w:p/>
-    <w:p/>
+    <w:p>
+      <w:r>
+        <w:t/>
+      </w:r>
+    </w:p>
+    <w:p>
+      <w:r>
+        <w:t/>
+      </w:r>
+    </w:p>
+    <w:p>
+      <w:r>
+        <w:t/>
+      </w:r>
+    </w:p>
     <w:p>
       <w:r>
         <w:t>Historique des versions du document</w:t>
       </w:r>
     </w:p>
-    <w:p/>
+    <w:p>
+      <w:r>
+        <w:t/>
+      </w:r>
+    </w:p>
     <w:tbl>
       <w:tblPr>
         <w:tblW w:w="9072" w:type="dxa"/>
@@ -736,25 +849,41 @@
           <w:tcPr>
             <w:tcW w:w="1134" w:type="dxa"/>
           </w:tcPr>
-          <w:p/>
+          <w:p>
+            <w:r>
+              <w:t/>
+            </w:r>
+          </w:p>
         </w:tc>
         <w:tc>
           <w:tcPr>
             <w:tcW w:w="1418" w:type="dxa"/>
           </w:tcPr>
-          <w:p/>
+          <w:p>
+            <w:r>
+              <w:t/>
+            </w:r>
+          </w:p>
         </w:tc>
         <w:tc>
           <w:tcPr>
             <w:tcW w:w="3969" w:type="dxa"/>
           </w:tcPr>
-          <w:p/>
+          <w:p>
+            <w:r>
+              <w:t/>
+            </w:r>
+          </w:p>
         </w:tc>
         <w:tc>
           <w:tcPr>
             <w:tcW w:w="2551" w:type="dxa"/>
           </w:tcPr>
-          <w:p/>
+          <w:p>
+            <w:r>
+              <w:t/>
+            </w:r>
+          </w:p>
         </w:tc>
       </w:tr>
       <w:tr>
@@ -762,25 +891,41 @@
           <w:tcPr>
             <w:tcW w:w="1134" w:type="dxa"/>
           </w:tcPr>
-          <w:p/>
+          <w:p>
+            <w:r>
+              <w:t/>
+            </w:r>
+          </w:p>
         </w:tc>
         <w:tc>
           <w:tcPr>
             <w:tcW w:w="1418" w:type="dxa"/>
           </w:tcPr>
-          <w:p/>
+          <w:p>
+            <w:r>
+              <w:t/>
+            </w:r>
+          </w:p>
         </w:tc>
         <w:tc>
           <w:tcPr>
             <w:tcW w:w="3969" w:type="dxa"/>
           </w:tcPr>
-          <w:p/>
+          <w:p>
+            <w:r>
+              <w:t/>
+            </w:r>
+          </w:p>
         </w:tc>
         <w:tc>
           <w:tcPr>
             <w:tcW w:w="2551" w:type="dxa"/>
           </w:tcPr>
-          <w:p/>
+          <w:p>
+            <w:r>
+              <w:t/>
+            </w:r>
+          </w:p>
         </w:tc>
       </w:tr>
       <w:tr>
@@ -788,25 +933,41 @@
           <w:tcPr>
             <w:tcW w:w="1134" w:type="dxa"/>
           </w:tcPr>
-          <w:p/>
+          <w:p>
+            <w:r>
+              <w:t/>
+            </w:r>
+          </w:p>
         </w:tc>
         <w:tc>
           <w:tcPr>
             <w:tcW w:w="1418" w:type="dxa"/>
           </w:tcPr>
-          <w:p/>
+          <w:p>
+            <w:r>
+              <w:t/>
+            </w:r>
+          </w:p>
         </w:tc>
         <w:tc>
           <w:tcPr>
             <w:tcW w:w="3969" w:type="dxa"/>
           </w:tcPr>
-          <w:p/>
+          <w:p>
+            <w:r>
+              <w:t/>
+            </w:r>
+          </w:p>
         </w:tc>
         <w:tc>
           <w:tcPr>
             <w:tcW w:w="2551" w:type="dxa"/>
           </w:tcPr>
-          <w:p/>
+          <w:p>
+            <w:r>
+              <w:t/>
+            </w:r>
+          </w:p>
         </w:tc>
       </w:tr>
     </w:tbl>
@@ -1883,6 +2044,9 @@
       <w:pPr>
         <w:pStyle w:val="BodyText"/>
       </w:pPr>
+      <w:r>
+        <w:t/>
+      </w:r>
     </w:p>
     <w:p>
       <w:pPr>
@@ -1974,7 +2138,11 @@
         </w:tc>
       </w:tr>
     </w:tbl>
-    <w:p/>
+    <w:p>
+      <w:r>
+        <w:t/>
+      </w:r>
+    </w:p>
     <w:tbl>
       <w:tblPr>
         <w:tblStyle w:val="Grilledutableau"/>
@@ -2293,7 +2461,11 @@
         </w:tc>
       </w:tr>
     </w:tbl>
-    <w:p/>
+    <w:p>
+      <w:r>
+        <w:t/>
+      </w:r>
+    </w:p>
     <w:p>
       <w:pPr>
         <w:pStyle w:val="Titre4"/>
@@ -2625,7 +2797,11 @@
           <w:tcPr>
             <w:tcW w:w="5598" w:type="dxa"/>
           </w:tcPr>
-          <w:p/>
+          <w:p>
+            <w:r>
+              <w:t/>
+            </w:r>
+          </w:p>
         </w:tc>
       </w:tr>
       <w:tr>
@@ -3116,7 +3292,11 @@
           <w:tcPr>
             <w:tcW w:w="4606" w:type="dxa"/>
           </w:tcPr>
-          <w:p/>
+          <w:p>
+            <w:r>
+              <w:t/>
+            </w:r>
+          </w:p>
         </w:tc>
       </w:tr>
       <w:tr>
@@ -3224,7 +3404,11 @@
         </w:tc>
       </w:tr>
     </w:tbl>
-    <w:p/>
+    <w:p>
+      <w:r>
+        <w:t/>
+      </w:r>
+    </w:p>
     <w:p>
       <w:r>
         <w:fldChar w:fldCharType="begin"/>
@@ -3877,7 +4061,11 @@
         </w:tc>
       </w:tr>
     </w:tbl>
-    <w:p/>
+    <w:p>
+      <w:r>
+        <w:t/>
+      </w:r>
+    </w:p>
     <w:p>
       <w:pPr>
         <w:pStyle w:val="Titre4"/>
@@ -4529,7 +4717,11 @@
           <w:tcPr>
             <w:tcW w:w="5598" w:type="dxa"/>
           </w:tcPr>
-          <w:p/>
+          <w:p>
+            <w:r>
+              <w:t/>
+            </w:r>
+          </w:p>
         </w:tc>
       </w:tr>
       <w:tr>
@@ -4986,7 +5178,11 @@
           <w:tcPr>
             <w:tcW w:w="4606" w:type="dxa"/>
           </w:tcPr>
-          <w:p/>
+          <w:p>
+            <w:r>
+              <w:t/>
+            </w:r>
+          </w:p>
         </w:tc>
       </w:tr>
       <w:tr>
@@ -5094,7 +5290,11 @@
         </w:tc>
       </w:tr>
     </w:tbl>
-    <w:p/>
+    <w:p>
+      <w:r>
+        <w:t/>
+      </w:r>
+    </w:p>
     <w:p>
       <w:r>
         <w:fldChar w:fldCharType="begin"/>
@@ -5654,9 +5854,21 @@
         <w:fldChar w:fldCharType="end"/>
       </w:r>
     </w:p>
-    <w:p/>
-    <w:p/>
-    <w:p/>
+    <w:p>
+      <w:r>
+        <w:t/>
+      </w:r>
+    </w:p>
+    <w:p>
+      <w:r>
+        <w:t/>
+      </w:r>
+    </w:p>
+    <w:p>
+      <w:r>
+        <w:t/>
+      </w:r>
+    </w:p>
     <w:p>
       <w:pPr>
         <w:pStyle w:val="Titre1"/>
@@ -6877,7 +7089,11 @@
         </w:tc>
       </w:tr>
     </w:tbl>
-    <w:p/>
+    <w:p>
+      <w:r>
+        <w:t/>
+      </w:r>
+    </w:p>
     <w:p>
       <w:r>
         <w:fldChar w:fldCharType="begin"/>
@@ -7287,7 +7503,11 @@
         </w:tc>
       </w:tr>
     </w:tbl>
-    <w:p/>
+    <w:p>
+      <w:r>
+        <w:t/>
+      </w:r>
+    </w:p>
     <w:p>
       <w:r>
         <w:fldChar w:fldCharType="begin"/>
@@ -8508,7 +8728,11 @@
         </w:tc>
       </w:tr>
     </w:tbl>
-    <w:p/>
+    <w:p>
+      <w:r>
+        <w:t/>
+      </w:r>
+    </w:p>
     <w:p>
       <w:r>
         <w:fldChar w:fldCharType="begin"/>
@@ -8924,7 +9148,11 @@
         </w:tc>
       </w:tr>
     </w:tbl>
-    <w:p/>
+    <w:p>
+      <w:r>
+        <w:t/>
+      </w:r>
+    </w:p>
     <w:p>
       <w:r>
         <w:fldChar w:fldCharType="begin"/>
@@ -8991,7 +9219,11 @@
         <w:fldChar w:fldCharType="end"/>
       </w:r>
     </w:p>
-    <w:p/>
+    <w:p>
+      <w:r>
+        <w:t/>
+      </w:r>
+    </w:p>
     <w:p>
       <w:pPr>
         <w:pStyle w:val="Titre1"/>
@@ -9131,7 +9363,11 @@
         <w:fldChar w:fldCharType="end"/>
       </w:r>
     </w:p>
-    <w:p/>
+    <w:p>
+      <w:r>
+        <w:t/>
+      </w:r>
+    </w:p>
     <w:p>
       <w:r>
         <w:fldChar w:fldCharType="begin"/>
@@ -9961,7 +10197,11 @@
         <w:fldChar w:fldCharType="end"/>
       </w:r>
     </w:p>
-    <w:p/>
+    <w:p>
+      <w:r>
+        <w:t/>
+      </w:r>
+    </w:p>
     <w:sectPr>
       <w:footerReference w:type="default" r:id="rId8"/>
       <w:pgSz w:w="11906" w:h="16838"/>
@@ -10053,7 +10293,11 @@
       <w:fldChar w:fldCharType="end"/>
     </w:r>
   </w:p>
-  <w:p/>
+  <w:p>
+    <w:r>
+      <w:t/>
+    </w:r>
+  </w:p>
 </w:ftr>
 </file>
 

</xml_diff>